<commit_message>
Afirma o ERP PHC CS como sistema único de relato financeiro no inquérito BDO.
Reforça fluxos, aplicações, interfaces e operações em torno do PHC,
alinhado com a confirmação de que a entidade utiliza este ERP.

Co-authored-by: ValterDomingues <ValterDomingues@users.noreply.github.com>
</commit_message>
<xml_diff>
--- a/docs/2.06.01_Understanding_Your_IT_Environment_PT_preenchido.docx
+++ b/docs/2.06.01_Understanding_Your_IT_Environment_PT_preenchido.docx
@@ -799,7 +799,7 @@
         </w:rPr>
       </w:pPr>
       <w:r>
-        <w:t>Equipa de Contabilidade / Financeiro e suporte TI (interno e prestador Espectro), com base em questionário e evidências do ambiente PHC.</w:t>
+        <w:t>Equipa de Contabilidade/Financeiro e suporte TI (interno e prestador Espectro). Sistema de informação relevante para o relato financeiro: ERP PHC CS (Cegid PHC), com base de dados Microsoft SQL Server 2022 Standard.</w:t>
       </w:r>
     </w:p>
     <w:p>
@@ -1883,35 +1883,42 @@
               </w:rPr>
             </w:pPr>
             <w:r>
-              <w:t>A entidade não dispõe de um departamento de TI com desenvolvimento de software interno estruturado.</w:t>
+              <w:t xml:space="preserve">A entidade utiliza o ERP PHC CS (Cegid PHC) como sistema central de processamento e registo da informação financeira (Gestão e Contabilidade, sobre Microsoft SQL Server).</w:t>
             </w:r>
           </w:p>
           <w:p>
             <w:r>
-              <w:t>A função de TI é assegurada de forma mista:</w:t>
+              <w:t xml:space="preserve"/>
             </w:r>
           </w:p>
           <w:p>
             <w:r>
-              <w:t>• Internamente: administração de utilizadores de negócio no ERP PHC, pedidos de acesso e acompanhamento operacional do relato financeiro.</w:t>
+              <w:t xml:space="preserve">A função de TI é assegurada de forma mista:</w:t>
             </w:r>
           </w:p>
           <w:p>
             <w:r>
-              <w:t>• Externamente (Espectro): manutenção de infraestruturas (servidores, rede, firewall, endpoints, Active Directory, backups e acesso remoto RDS).</w:t>
+              <w:t xml:space="preserve">• Internamente: administração funcional do PHC (utilizadores de negócio, pedidos de acesso à aplicação, fechos e mapas do relato financeiro).</w:t>
             </w:r>
           </w:p>
           <w:p>
             <w:r>
-              <w:t>• Fornecedor da aplicação PHC / parceiro Cegid PHC: desenvolvimento/parametrização, updates da aplicação e apoio a mapas/obrigações fiscais quando contratado.</w:t>
+              <w:t xml:space="preserve">• Externamente (Espectro): manutenção de infraestruturas que suportam o PHC (servidores Windows, SQL Server, rede, firewall Sonicwall, Active Directory, backups e acesso remoto RDS).</w:t>
             </w:r>
           </w:p>
           <w:p>
-            <w:r/>
+            <w:r>
+              <w:t xml:space="preserve">• Fornecedor/parceiro PHC (Cegid PHC): updates da aplicação, parametrização e apoio a módulos/mapas fiscais quando contratado.</w:t>
+            </w:r>
           </w:p>
           <w:p>
             <w:r>
-              <w:t>Não existe função formal separada de Segurança dos Sistemas de Informação; as responsabilidades de segurança (firewall NGFW Sonicwall, antivírus Kaspersky, AD, backups) são partilhadas entre a entidade e o prestador Espectro, alinhadas com o princípio do menor privilégio.</w:t>
+              <w:t xml:space="preserve"/>
+            </w:r>
+          </w:p>
+          <w:p>
+            <w:r>
+              <w:t xml:space="preserve">Não existe função formal separada de Segurança dos SI; a segurança do ambiente que hospeda o PHC (firewall NGFW, antivírus Kaspersky, AD, backups) é partilhada entre a entidade e o prestador Espectro, com princípio do menor privilégio.</w:t>
             </w:r>
           </w:p>
         </w:tc>
@@ -3213,7 +3220,7 @@
               </w:rPr>
             </w:pPr>
             <w:r>
-              <w:t>Cegid PHC / Parceiro PHC</w:t>
+              <w:t xml:space="preserve">Cegid PHC / Parceiro PHC</w:t>
             </w:r>
           </w:p>
         </w:tc>
@@ -3229,12 +3236,17 @@
               </w:rPr>
             </w:pPr>
             <w:r>
-              <w:t>Fornecimento e manutenção do ERP PHC CS (módulos de gestão e contabilidade relevantes para o relato financeiro), atualizações legais/fiscais e suporte funcional.</w:t>
+              <w:t xml:space="preserve">Fornecimento, manutenção e atualização do ERP PHC CS — sistema único relevante para o relato financeiro da entidade (módulos de Gestão e Contabilidade; outros módulos conforme licenciamento).</w:t>
             </w:r>
           </w:p>
           <w:p>
             <w:r>
-              <w:t>Processos do fornecedor de software + parametrização da entidade. Relatório SOC: não tipicamente aplicável ao software on-premises; a confirmar se existir hosting/cloud PHC.</w:t>
+              <w:t xml:space="preserve">Inclui releases legais/fiscais (IVA, SAF-T, IES, Modelos) e suporte funcional/parametrização.</w:t>
+            </w:r>
+          </w:p>
+          <w:p>
+            <w:r>
+              <w:t xml:space="preserve">Processos do fornecedor de software + parametrização da entidade. Relatório SOC: tipicamente não aplicável a instalação on-premises; a confirmar se existir componente cloud/hospedagem PHC.</w:t>
             </w:r>
           </w:p>
         </w:tc>
@@ -4163,7 +4175,7 @@
               </w:rPr>
             </w:pPr>
             <w:r>
-              <w:t>NA — Sem implantação de nova aplicação contabilística/financeira no período (ERP PHC já em uso).</w:t>
+              <w:t xml:space="preserve">NA — Sem implantação de nova aplicação contabilística/financeira. O relato financeiro continua a ser processado no ERP PHC CS já em uso.</w:t>
             </w:r>
           </w:p>
         </w:tc>
@@ -4254,7 +4266,7 @@
               </w:rPr>
             </w:pPr>
             <w:r>
-              <w:t>NA — PHC permanece em uso; sem fim de vida planeado no período.</w:t>
+              <w:t xml:space="preserve">NA — O ERP PHC permanece em uso como sistema de relato; sem fim de vida planeado no período.</w:t>
             </w:r>
           </w:p>
         </w:tc>
@@ -4307,7 +4319,7 @@
               <w:cnfStyle w:val="000000100000" w:firstRow="0" w:lastRow="0" w:firstColumn="0" w:lastColumn="0" w:oddVBand="0" w:evenVBand="0" w:oddHBand="1" w:evenHBand="0" w:firstRowFirstColumn="0" w:firstRowLastColumn="0" w:lastRowFirstColumn="0" w:lastRowLastColumn="0"/>
             </w:pPr>
             <w:r>
-              <w:t>Atualizações regulares do PHC (releases legais/fiscais Cegid PHC) e patches de SO/SQL geridos com o prestador. Sem upgrade major disruptivo reportado — a confirmar versões aplicadas no período.</w:t>
+              <w:t xml:space="preserve">Atualizações regulares do ERP PHC (releases legais/fiscais Cegid PHC) e patches de SO/SQL Server geridos com o prestador Espectro. Indicar no período as versões/builds PHC aplicadas, se material.</w:t>
             </w:r>
           </w:p>
         </w:tc>
@@ -4350,7 +4362,7 @@
               </w:rPr>
             </w:pPr>
             <w:r>
-              <w:t>NA — Sem migração de dados para novo sistema no período.</w:t>
+              <w:t xml:space="preserve">NA — Sem migração de dados para novo sistema; dados financeiros permanecem na base SQL Server do PHC.</w:t>
             </w:r>
           </w:p>
         </w:tc>
@@ -4398,7 +4410,7 @@
               </w:rPr>
             </w:pPr>
             <w:r>
-              <w:t>Projetos de melhoria/automação em torno do PHC (integrações, mapas, rotinas) podem ocorrer sem mudança de sistema de relato — detalhar se material para as DF.</w:t>
+              <w:t xml:space="preserve">Eventuais melhorias/automações em torno do PHC (integrações, mapas, rotinas) sem substituição do ERP — detalhar apenas se material para as DF.</w:t>
             </w:r>
           </w:p>
         </w:tc>
@@ -4441,7 +4453,7 @@
               </w:rPr>
             </w:pPr>
             <w:r>
-              <w:t>NA — Sem adoção de blockchain/RPA/IA com impacto material nas DF no período (ver secção 2.3).</w:t>
+              <w:t xml:space="preserve">NA — Sem adoção de blockchain/RPA/IA com impacto material nas DF; o processamento financeiro assenta no PHC.</w:t>
             </w:r>
           </w:p>
         </w:tc>
@@ -5255,7 +5267,7 @@
               <w:pStyle w:val="BDOTableBody"/>
             </w:pPr>
             <w:r>
-              <w:t>PHC Contabilidade CS (diários, movimentos, balancetes, apuramentos, mapas, IES/IVA/SAF-T)</w:t>
+              <w:t xml:space="preserve">ERP PHC Contabilidade CS — diários, movimentos, balancetes, apuramentos, mapas de gestão, IES/IVA/SAF-T e demais saídas do relato financeiro</w:t>
             </w:r>
           </w:p>
         </w:tc>
@@ -5432,7 +5444,7 @@
               </w:rPr>
             </w:pPr>
             <w:r>
-              <w:t xml:space="preserve">ERP / COTS parametrizável (PHC CS)</w:t>
+              <w:t xml:space="preserve">ERP PHC CS (COTS parametrizável)</w:t>
             </w:r>
           </w:p>
         </w:tc>
@@ -5484,7 +5496,7 @@
               <w:pStyle w:val="BDOTableBody"/>
             </w:pPr>
             <w:r>
-              <w:t>PHC Gestão CS — Compras / Fornecedores</w:t>
+              <w:t xml:space="preserve">ERP PHC Gestão CS — Compras / Fornecedores (integração nativa para Contabilidade)</w:t>
             </w:r>
           </w:p>
         </w:tc>
@@ -5720,7 +5732,7 @@
               <w:pStyle w:val="BDOTableBody"/>
             </w:pPr>
             <w:r>
-              <w:t>PHC Gestão CS — Vendas / Clientes / Faturação</w:t>
+              <w:t xml:space="preserve">ERP PHC Gestão CS — Vendas / Clientes / Faturação (integração nativa para Contabilidade)</w:t>
             </w:r>
           </w:p>
         </w:tc>
@@ -5953,7 +5965,7 @@
               <w:pStyle w:val="BDOTableBody"/>
             </w:pPr>
             <w:r>
-              <w:t>PHC Gestão CS — Tesouraria / Contas correntes</w:t>
+              <w:t xml:space="preserve">ERP PHC Gestão CS — Tesouraria / Contas correntes (integração nativa para Contabilidade)</w:t>
             </w:r>
           </w:p>
         </w:tc>
@@ -6172,7 +6184,7 @@
               <w:pStyle w:val="BDOTableBody"/>
             </w:pPr>
             <w:r>
-              <w:t>Imobilizado / Amortizações (se licenciado)</w:t>
+              <w:t xml:space="preserve">Imobilizado / Amortizações</w:t>
             </w:r>
           </w:p>
         </w:tc>
@@ -6186,7 +6198,7 @@
               <w:pStyle w:val="BDOTableBody"/>
             </w:pPr>
             <w:r>
-              <w:t>PHC Imobilizado CS</w:t>
+              <w:t xml:space="preserve">ERP PHC Imobilizado CS (módulo do mesmo ERP; indicar NA nesta linha apenas se o módulo não estiver licenciado)</w:t>
             </w:r>
           </w:p>
         </w:tc>
@@ -6368,7 +6380,7 @@
               </w:rPr>
             </w:pPr>
             <w:r>
-              <w:t xml:space="preserve">ERP / módulo Imobilizado PHC (se licenciado)</w:t>
+              <w:t xml:space="preserve">ERP PHC CS — módulo Imobilizado</w:t>
             </w:r>
           </w:p>
         </w:tc>
@@ -6594,35 +6606,47 @@
               </w:rPr>
             </w:pPr>
             <w:r>
-              <w:t>DIAGRAMA / DESCRIÇÃO DO FLUXO DE DADOS — RELATO FINANCEIRO (PHC)</w:t>
-            </w:r>
-          </w:p>
-          <w:p>
-            <w:r/>
-          </w:p>
-          <w:p>
-            <w:r>
-              <w:t>[Entradas operacionais]</w:t>
+              <w:t xml:space="preserve">DIAGRAMA / DESCRIÇÃO DO FLUXO DE DADOS — RELATO FINANCEIRO</w:t>
             </w:r>
           </w:p>
           <w:p>
             <w:r>
-              <w:t xml:space="preserve">  PHC Gestão (faturação, compras, stocks, contas correntes, tesouraria)</w:t>
+              <w:t xml:space="preserve"/>
             </w:r>
           </w:p>
           <w:p>
             <w:r>
-              <w:t xml:space="preserve">  + PHC Pessoal / Imobilizado / Letras (se aplicável)</w:t>
+              <w:t xml:space="preserve">Sistema de relato: ERP PHC CS (único ERP utilizado pela entidade para processar e registar a informação financeira), com BD Microsoft SQL Server 2022 Standard no data center local.</w:t>
             </w:r>
           </w:p>
           <w:p>
             <w:r>
-              <w:t xml:space="preserve">  + Lançamentos manuais e documentos pré-definidos na Contabilidade</w:t>
+              <w:t xml:space="preserve"/>
             </w:r>
           </w:p>
           <w:p>
             <w:r>
-              <w:t xml:space="preserve">        │  integração online (tempo real) ou batch, conforme parametrização</w:t>
+              <w:t xml:space="preserve">[Entradas operacionais no PHC]</w:t>
+            </w:r>
+          </w:p>
+          <w:p>
+            <w:r>
+              <w:t xml:space="preserve">  Módulos PHC Gestão (faturação, compras, stocks, contas correntes, tesouraria)</w:t>
+            </w:r>
+          </w:p>
+          <w:p>
+            <w:r>
+              <w:t xml:space="preserve">  + módulos PHC Pessoal / Imobilizado / Letras (se licenciados)</w:t>
+            </w:r>
+          </w:p>
+          <w:p>
+            <w:r>
+              <w:t xml:space="preserve">  + lançamentos manuais e documentos pré-definidos no PHC Contabilidade</w:t>
+            </w:r>
+          </w:p>
+          <w:p>
+            <w:r>
+              <w:t xml:space="preserve">        │  integração nativa PHC (online/tempo real ou sob processamento)</w:t>
             </w:r>
           </w:p>
           <w:p>
@@ -6632,12 +6656,12 @@
           </w:p>
           <w:p>
             <w:r>
-              <w:t>[PHC Contabilidade]</w:t>
+              <w:t xml:space="preserve">[PHC Contabilidade]</w:t>
             </w:r>
           </w:p>
           <w:p>
             <w:r>
-              <w:t xml:space="preserve">  Diários → documentos contabilísticos → linhas a débito/crédito (SQL Server)</w:t>
+              <w:t xml:space="preserve">  Diários → documentos → linhas a débito/crédito (SQL Server)</w:t>
             </w:r>
           </w:p>
           <w:p>
@@ -6652,7 +6676,7 @@
           </w:p>
           <w:p>
             <w:r>
-              <w:t>[Apuramentos]</w:t>
+              <w:t xml:space="preserve">[Apuramentos no PHC]</w:t>
             </w:r>
           </w:p>
           <w:p>
@@ -6667,12 +6691,12 @@
           </w:p>
           <w:p>
             <w:r>
-              <w:t xml:space="preserve">        ├──► Mapas de gestão / Balanço / DR / DFC / balancetes / extratos</w:t>
+              <w:t xml:space="preserve">        ├──► Mapas / Balanço / DR / DFC / balancetes / extratos (PHC)</w:t>
             </w:r>
           </w:p>
           <w:p>
             <w:r>
-              <w:t xml:space="preserve">        ├──► Monitor de tarefas/obrigações (IVA, IES, Modelo 22/30, SAF-T PT)</w:t>
+              <w:t xml:space="preserve">        ├──► Obrigações declarativas (IVA, IES, Modelo 22/30, SAF-T PT)</w:t>
             </w:r>
           </w:p>
           <w:p>
@@ -6681,11 +6705,13 @@
             </w:r>
           </w:p>
           <w:p>
-            <w:r/>
+            <w:r>
+              <w:t xml:space="preserve"/>
+            </w:r>
           </w:p>
           <w:p>
             <w:r>
-              <w:t>Características: contabilidade em tempo real; acessos por utilizador e data fechada; BD SQL Server 2022 Standard no servidor local; acesso utilizadores via RDS.</w:t>
+              <w:t xml:space="preserve">Acesso dos utilizadores ao PHC: sessão RDS; identidades AD; proteção de rede Sonicwall; antivírus Kaspersky.</w:t>
             </w:r>
           </w:p>
         </w:tc>
@@ -6791,124 +6817,122 @@
               </w:rPr>
             </w:pPr>
             <w:r>
-              <w:t>DETALHES DE FLUXOS, ENTRADAS, SAÍDAS E RELATÓRIOS</w:t>
-            </w:r>
-          </w:p>
-          <w:p>
-            <w:r/>
-          </w:p>
-          <w:p>
-            <w:r>
-              <w:t>1) ENTRADAS</w:t>
+              <w:t xml:space="preserve">DETALHES DE FLUXOS, ENTRADAS, SAÍDAS E RELATÓRIOS</w:t>
             </w:r>
           </w:p>
           <w:p>
             <w:r>
-              <w:t>• Parametrização: plano de contas SNC, diários, documentos pré-definidos, centros de custo, fórmulas de mapas/IES, códigos de tesouraria (DFC), perfis de acesso.</w:t>
+              <w:t xml:space="preserve">(Entidade utiliza exclusivamente o ERP PHC CS para o relato financeiro)</w:t>
             </w:r>
           </w:p>
           <w:p>
             <w:r>
-              <w:t>• Documentos de Gestão integrados na Contabilidade: faturas venda/compra, NC/ND, recibos, pagamentos, depósitos, movimentos de caixa, transferências.</w:t>
+              <w:t xml:space="preserve"/>
             </w:r>
           </w:p>
           <w:p>
             <w:r>
-              <w:t>• Imobilizado: depreciações, reavaliações, imparidades, abates (se módulo ativo).</w:t>
+              <w:t xml:space="preserve">1) ENTRADAS (no PHC)</w:t>
             </w:r>
           </w:p>
           <w:p>
             <w:r>
-              <w:t>• Pessoal: ordenados/retenções (se integração ativa).</w:t>
+              <w:t xml:space="preserve">• Parametrização PHC: plano de contas SNC, diários, documentos pré-definidos, centros de custo, fórmulas de mapas/IES, códigos de tesouraria (DFC), perfis de acesso e data fechada.</w:t>
             </w:r>
           </w:p>
           <w:p>
             <w:r>
-              <w:t>• Inventários finais para apuramento CMVMC.</w:t>
+              <w:t xml:space="preserve">• Documentos no PHC Gestão integrados na Contabilidade: faturas venda/compra, NC/ND, recibos, pagamentos, depósitos, movimentos de caixa, transferências.</w:t>
             </w:r>
           </w:p>
           <w:p>
             <w:r>
-              <w:t>• Extratos bancários para reconciliação.</w:t>
-            </w:r>
-          </w:p>
-          <w:p>
-            <w:r/>
-          </w:p>
-          <w:p>
-            <w:r>
-              <w:t>2) PROCESSAMENTO</w:t>
+              <w:t xml:space="preserve">• PHC Imobilizado / Pessoal / Letras: processamentos com integração contabilística, quando licenciados.</w:t>
             </w:r>
           </w:p>
           <w:p>
             <w:r>
-              <w:t>• Integração documental → movimentos contabilísticos.</w:t>
+              <w:t xml:space="preserve">• Inventários finais (CMVMC) e extratos bancários (reconciliação) tratados no PHC.</w:t>
             </w:r>
           </w:p>
           <w:p>
             <w:r>
-              <w:t>• Apuramento/simulação de IVA, resultados, CMVMC, imposto de selo.</w:t>
+              <w:t xml:space="preserve"/>
             </w:r>
           </w:p>
           <w:p>
             <w:r>
-              <w:t>• Produção de DF e mapas de gestão; geração SAF-T Contabilidade e declarações.</w:t>
-            </w:r>
-          </w:p>
-          <w:p>
-            <w:r/>
-          </w:p>
-          <w:p>
-            <w:r>
-              <w:t>3) SAÍDAS / RELATÓRIOS RELEVANTES PARA DF</w:t>
+              <w:t xml:space="preserve">2) PROCESSAMENTO (no PHC)</w:t>
             </w:r>
           </w:p>
           <w:p>
             <w:r>
-              <w:t>• Balancetes, diários, extratos de conta.</w:t>
+              <w:t xml:space="preserve">• Integração documental nativa → movimentos contabilísticos em tempo real.</w:t>
             </w:r>
           </w:p>
           <w:p>
             <w:r>
-              <w:t>• Balanço, Demonstração de Resultados, Demonstração de Fluxos de Caixa, notas às DF.</w:t>
+              <w:t xml:space="preserve">• Apuramento/simulação de IVA, resultados, CMVMC, imposto de selo.</w:t>
             </w:r>
           </w:p>
           <w:p>
             <w:r>
-              <w:t>• Declaração Periódica/Anual de IVA e anexos; IES; Modelo 22; Modelo 30; SAF-T PT.</w:t>
+              <w:t xml:space="preserve">• Produção de demonstrações financeiras, mapas de gestão e ficheiros AT a partir do PHC.</w:t>
             </w:r>
           </w:p>
           <w:p>
             <w:r>
-              <w:t>• Mapas recapitulativos; dashboards/mapas de gestão parametrizáveis.</w:t>
+              <w:t xml:space="preserve"/>
             </w:r>
           </w:p>
           <w:p>
             <w:r>
-              <w:t>• Backups da BD SQL Server (cópia de salvaguarda dos dados financeiros).</w:t>
-            </w:r>
-          </w:p>
-          <w:p>
-            <w:r/>
-          </w:p>
-          <w:p>
-            <w:r>
-              <w:t>4) CONTROLLOS TRANSVERSAIS</w:t>
+              <w:t xml:space="preserve">3) SAÍDAS / RELATÓRIOS (gerados pelo PHC)</w:t>
             </w:r>
           </w:p>
           <w:p>
             <w:r>
-              <w:t>• Autenticação PHC (utilizador/password) + sessão RDS/AD na infraestrutura.</w:t>
+              <w:t xml:space="preserve">• Balancetes, diários, extratos de conta.</w:t>
             </w:r>
           </w:p>
           <w:p>
             <w:r>
-              <w:t>• Segregação de funções por perfis PHC e grupos AD.</w:t>
+              <w:t xml:space="preserve">• Balanço, Demonstração de Resultados, Demonstração de Fluxos de Caixa, notas às DF.</w:t>
             </w:r>
           </w:p>
           <w:p>
             <w:r>
-              <w:t>• Prestador Espectro na camada infra; Contabilidade na validação de mapas e fechos.</w:t>
+              <w:t xml:space="preserve">• Declaração Periódica/Anual de IVA e anexos; IES; Modelo 22; Modelo 30; SAF-T PT Contabilidade.</w:t>
+            </w:r>
+          </w:p>
+          <w:p>
+            <w:r>
+              <w:t xml:space="preserve">• Mapas recapitulativos e mapas de gestão parametrizáveis.</w:t>
+            </w:r>
+          </w:p>
+          <w:p>
+            <w:r>
+              <w:t xml:space="preserve">• Cópia de salvaguarda: backups da BD SQL Server do PHC (local + cloud).</w:t>
+            </w:r>
+          </w:p>
+          <w:p>
+            <w:r>
+              <w:t xml:space="preserve"/>
+            </w:r>
+          </w:p>
+          <w:p>
+            <w:r>
+              <w:t xml:space="preserve">4) CONTROLLOS</w:t>
+            </w:r>
+          </w:p>
+          <w:p>
+            <w:r>
+              <w:t xml:space="preserve">• Autenticação PHC (utilizador/password) + sessão RDS/AD na infraestrutura.</w:t>
+            </w:r>
+          </w:p>
+          <w:p>
+            <w:r>
+              <w:t xml:space="preserve">• Segregação por perfis PHC e grupos AD; prestador Espectro na camada infra.</w:t>
             </w:r>
           </w:p>
         </w:tc>
@@ -7625,7 +7649,7 @@
               </w:rPr>
             </w:pPr>
             <w:r>
-              <w:t>Interface nativa do ERP: documentos de faturação, compras, recibos, pagamentos e tesouraria geram/atualizam movimentos contabilísticos. Natureza: documentos e valores a débito/crédito. Controlo: conferência de integração, balancetes, reconciliações e data fechada.</w:t>
+              <w:t xml:space="preserve">Interface nativa do ERP PHC: documentos de faturação, compras, recibos, pagamentos e tesouraria geram/atualizam movimentos no PHC Contabilidade. Natureza: documentos e valores a débito/crédito. Controlo: conferência de integração no PHC, balancetes, reconciliações e data fechada.</w:t>
             </w:r>
           </w:p>
         </w:tc>
@@ -7764,7 +7788,7 @@
               <w:spacing w:line="240" w:lineRule="auto"/>
             </w:pPr>
             <w:r>
-              <w:t>PHC Contabilidade → Autoridade Tributária</w:t>
+              <w:t xml:space="preserve">PHC Contabilidade → Autoridade Tributária</w:t>
             </w:r>
           </w:p>
         </w:tc>
@@ -7778,7 +7802,7 @@
               <w:spacing w:line="240" w:lineRule="auto"/>
             </w:pPr>
             <w:r>
-              <w:t>Produção e envio de SAF-T PT, IES, declarações IVA, Modelos 22/30 (eletrónico). Controlo: Monitor de obrigações, validação/analisador SAF-T, revisão Contabilidade antes do envio.</w:t>
+              <w:t xml:space="preserve">Produção no PHC e envio de SAF-T PT, IES, declarações IVA, Modelos 22/30. Controlo: monitor/rotinas do PHC, validação SAF-T e revisão Contabilidade antes do envio.</w:t>
             </w:r>
           </w:p>
         </w:tc>
@@ -7811,7 +7835,7 @@
               <w:spacing w:line="240" w:lineRule="auto"/>
             </w:pPr>
             <w:r>
-              <w:t>SQL Server / Backups → Cloud (replicação)</w:t>
+              <w:t xml:space="preserve">SQL Server (BD do PHC) → Backup / Cloud</w:t>
             </w:r>
           </w:p>
         </w:tc>
@@ -7864,7 +7888,7 @@
               </w:rPr>
             </w:pPr>
             <w:r>
-              <w:t>Postos de trabalho / RDS → PHC</w:t>
+              <w:t xml:space="preserve">Postos de trabalho / RDS → ERP PHC</w:t>
             </w:r>
           </w:p>
         </w:tc>
@@ -7969,12 +7993,12 @@
               </w:rPr>
             </w:pPr>
             <w:r>
-              <w:t>NA — A entidade não utiliza blockchain, RPA, inteligência artificial ou outros componentes de tecnologia complexa com impacto material no processamento ou relato financeiro.</w:t>
+              <w:t xml:space="preserve">NA — A entidade não utiliza blockchain, RPA, inteligência artificial ou outros componentes de tecnologia complexa com impacto material no relato financeiro.</w:t>
             </w:r>
           </w:p>
           <w:p>
             <w:r>
-              <w:t>O ambiente relevante assenta em ERP PHC CS sobre Microsoft SQL Server, com acesso RDS e controlos de rede/endpoint tradicionais.</w:t>
+              <w:t xml:space="preserve">O processamento e registo da informação financeira assentam no ERP PHC CS sobre Microsoft SQL Server, com acesso RDS e controlos de rede/endpoint tradicionais.</w:t>
             </w:r>
           </w:p>
         </w:tc>
@@ -10384,17 +10408,17 @@
               </w:rPr>
             </w:pPr>
             <w:r>
-              <w:t>NA — Não ocorreu implementação de novo sistema relevante para o relato financeiro no período objeto de auditoria.</w:t>
+              <w:t xml:space="preserve">NA — Não ocorreu implementação de novo sistema relevante para o relato financeiro no período.</w:t>
             </w:r>
           </w:p>
           <w:p>
             <w:r>
-              <w:t>O ERP PHC CS (Gestão + Contabilidade sobre SQL Server 2022 Standard) mantém-se como sistema de processamento e registo da informação financeira.</w:t>
+              <w:t xml:space="preserve">O ERP PHC CS (Gestão + Contabilidade sobre SQL Server 2022 Standard) é o sistema utilizado pela entidade para processar e registar a informação financeira e mantém-se em produção.</w:t>
             </w:r>
           </w:p>
           <w:p>
             <w:r>
-              <w:t>(Se no período tiver havido go-live de módulo novo material — Imobilizado, Pessoal, etc. — completar aqui com fases, data de início de uso e migração de dados.)</w:t>
+              <w:t xml:space="preserve">(Se no período tiver havido ativação de módulo PHC adicional material — ex. Imobilizado ou Pessoal — completar com fases, data de início de uso e eventual migração de dados.)</w:t>
             </w:r>
           </w:p>
         </w:tc>
@@ -10651,35 +10675,37 @@
               </w:rPr>
             </w:pPr>
             <w:r>
-              <w:t>O processamento financeiro quotidiano é predominantemente online/transacional no PHC (lançamentos e integração em tempo real), e não um data center com filas batch complexas internas.</w:t>
+              <w:t xml:space="preserve">Os dados financeiros são geridos e processados no ERP PHC (transacional/online). Não existe um motor batch autónomo externo ao PHC para o relato financeiro quotidiano.</w:t>
             </w:r>
           </w:p>
           <w:p>
             <w:r>
-              <w:t>Operações periódicas relevantes:</w:t>
+              <w:t xml:space="preserve">Operações periódicas:</w:t>
             </w:r>
           </w:p>
           <w:p>
             <w:r>
-              <w:t>• Apuramentos e produção de mapas/declarações pela Contabilidade (IVA, resultados, CMVMC, IES, SAF-T).</w:t>
+              <w:t xml:space="preserve">• Apuramentos e produção de mapas/declarações no PHC pela Contabilidade (IVA, resultados, CMVMC, IES, SAF-T).</w:t>
             </w:r>
           </w:p>
           <w:p>
             <w:r>
-              <w:t>• Jobs de backup da BD SQL Server (diário + replicação cloud) executados/monitorizados pelo prestador Espectro.</w:t>
+              <w:t xml:space="preserve">• Jobs de backup da BD SQL Server do PHC (diário + replicação cloud) pelo prestador Espectro.</w:t>
             </w:r>
           </w:p>
           <w:p>
             <w:r>
-              <w:t>• Updates/patches de SO e motor SQL em janelas de manutenção.</w:t>
+              <w:t xml:space="preserve">• Patches de SO/SQL em janelas de manutenção.</w:t>
             </w:r>
           </w:p>
           <w:p>
-            <w:r/>
+            <w:r>
+              <w:t xml:space="preserve"/>
+            </w:r>
           </w:p>
           <w:p>
             <w:r>
-              <w:t>Segregação: Contabilidade valida precisão/completude dos mapas e declarações; TI/prestador gere jobs técnicos e disponibilidade; erros de integração/documentos tratados funcionalmente no PHC e reconciliados pela Contabilidade.</w:t>
+              <w:t xml:space="preserve">Segregação: Contabilidade valida precisão/completude dos mapas e declarações no PHC; TI/prestador assegura disponibilidade da plataforma; exceções de integração tratadas funcionalmente no PHC e reconciliadas pela Contabilidade.</w:t>
             </w:r>
           </w:p>
         </w:tc>

</xml_diff>